<commit_message>
Wk1-2 outlines: outlines link assignments, don't restate them
One source of reality per assignment. Pare the day outlines to link the
reading homework / assignments instead of describing them; move the
article citations + URLs into the reading-homework docx (the assignment
owns them). Remove the premature 5-reading table from the Reading
Journal doc. Fix footers (reading link no longer "in Canvas").

Co-Authored-By: Claude Opus 4.8 (1M context) <noreply@anthropic.com>
</commit_message>
<xml_diff>
--- a/week-1-reasoning-puzzles/reading-journal.docx
+++ b/week-1-reasoning-puzzles/reading-journal.docx
@@ -44,7 +44,7 @@
           <w:rFonts w:ascii="Inter" w:hAnsi="Inter"/>
           <w:i w:val="0"/>
         </w:rPr>
-        <w:t>Each week you read one short article and write a single dated journal entry that connects the reading to the mathematics you did that week. Five readings, five entries, kept in Marginalia, our reading-and-writing app. By the end, they show how your thinking grew over the first five weeks.</w:t>
+        <w:t>Each week you read the assigned article(s) and write a single dated journal entry connecting the reading to the mathematics you did that week, kept in Marginalia, our reading-and-writing app. By the end, they show how your thinking grew across Act I.</w:t>
       </w:r>
     </w:p>
     <w:p>
@@ -97,317 +97,6 @@
         <w:t>Make notes in the margins as you read, then write a short reflection connecting it to that week's mathematics and your own reasoning. One entry per week; each week's homework sheet gives you that week's prompt.</w:t>
       </w:r>
     </w:p>
-    <w:p>
-      <w:pPr>
-        <w:spacing w:after="80"/>
-      </w:pPr>
-      <w:r>
-        <w:rPr>
-          <w:rFonts w:ascii="Inter" w:hAnsi="Inter"/>
-          <w:b/>
-          <w:color w:val="1F4E96"/>
-          <w:sz w:val="24"/>
-        </w:rPr>
-        <w:t>The five readings</w:t>
-      </w:r>
-    </w:p>
-    <w:tbl>
-      <w:tblPr>
-        <w:tblStyle w:val="TableGrid"/>
-        <w:tblW w:type="auto" w:w="0"/>
-        <w:tblLook w:firstColumn="1" w:firstRow="1" w:lastColumn="0" w:lastRow="0" w:noHBand="0" w:noVBand="1" w:val="04A0"/>
-      </w:tblPr>
-      <w:tblGrid>
-        <w:gridCol w:w="3504"/>
-        <w:gridCol w:w="3504"/>
-        <w:gridCol w:w="3504"/>
-      </w:tblGrid>
-      <w:tr>
-        <w:tc>
-          <w:tcPr>
-            <w:tcW w:type="dxa" w:w="3504"/>
-            <w:shd w:val="clear" w:fill="D9D9D9"/>
-          </w:tcPr>
-          <w:p>
-            <w:r>
-              <w:rPr>
-                <w:rFonts w:ascii="Inter" w:hAnsi="Inter"/>
-                <w:b/>
-                <w:sz w:val="20"/>
-              </w:rPr>
-              <w:t>Week</w:t>
-            </w:r>
-          </w:p>
-        </w:tc>
-        <w:tc>
-          <w:tcPr>
-            <w:tcW w:type="dxa" w:w="3504"/>
-            <w:shd w:val="clear" w:fill="D9D9D9"/>
-          </w:tcPr>
-          <w:p>
-            <w:r>
-              <w:rPr>
-                <w:rFonts w:ascii="Inter" w:hAnsi="Inter"/>
-                <w:b/>
-                <w:sz w:val="20"/>
-              </w:rPr>
-              <w:t>Reading</w:t>
-            </w:r>
-          </w:p>
-        </w:tc>
-        <w:tc>
-          <w:tcPr>
-            <w:tcW w:type="dxa" w:w="3504"/>
-            <w:shd w:val="clear" w:fill="D9D9D9"/>
-          </w:tcPr>
-          <w:p>
-            <w:r>
-              <w:rPr>
-                <w:rFonts w:ascii="Inter" w:hAnsi="Inter"/>
-                <w:b/>
-                <w:sz w:val="20"/>
-              </w:rPr>
-              <w:t>Lens on that week's math</w:t>
-            </w:r>
-          </w:p>
-        </w:tc>
-      </w:tr>
-      <w:tr>
-        <w:tc>
-          <w:tcPr>
-            <w:tcW w:type="dxa" w:w="3504"/>
-          </w:tcPr>
-          <w:p>
-            <w:r>
-              <w:rPr>
-                <w:rFonts w:ascii="Inter" w:hAnsi="Inter"/>
-                <w:b/>
-                <w:sz w:val="20"/>
-              </w:rPr>
-              <w:t>1</w:t>
-            </w:r>
-          </w:p>
-        </w:tc>
-        <w:tc>
-          <w:tcPr>
-            <w:tcW w:type="dxa" w:w="3504"/>
-          </w:tcPr>
-          <w:p>
-            <w:r>
-              <w:rPr>
-                <w:rFonts w:ascii="Inter" w:hAnsi="Inter"/>
-                <w:b/>
-                <w:sz w:val="20"/>
-              </w:rPr>
-              <w:t>McFeetors &amp; Palfy (2017)</w:t>
-            </w:r>
-          </w:p>
-        </w:tc>
-        <w:tc>
-          <w:tcPr>
-            <w:tcW w:type="dxa" w:w="3504"/>
-          </w:tcPr>
-          <w:p>
-            <w:r>
-              <w:rPr>
-                <w:rFonts w:ascii="Inter" w:hAnsi="Inter"/>
-                <w:b w:val="0"/>
-                <w:sz w:val="20"/>
-              </w:rPr>
-              <w:t>games as a site for mathematical reasoning</w:t>
-            </w:r>
-          </w:p>
-        </w:tc>
-      </w:tr>
-      <w:tr>
-        <w:tc>
-          <w:tcPr>
-            <w:tcW w:type="dxa" w:w="3504"/>
-          </w:tcPr>
-          <w:p>
-            <w:r>
-              <w:rPr>
-                <w:rFonts w:ascii="Inter" w:hAnsi="Inter"/>
-                <w:b/>
-                <w:sz w:val="20"/>
-              </w:rPr>
-              <w:t>2</w:t>
-            </w:r>
-          </w:p>
-        </w:tc>
-        <w:tc>
-          <w:tcPr>
-            <w:tcW w:type="dxa" w:w="3504"/>
-          </w:tcPr>
-          <w:p>
-            <w:r>
-              <w:rPr>
-                <w:rFonts w:ascii="Inter" w:hAnsi="Inter"/>
-                <w:b/>
-                <w:sz w:val="20"/>
-              </w:rPr>
-              <w:t>Reinhart (2000)</w:t>
-            </w:r>
-          </w:p>
-        </w:tc>
-        <w:tc>
-          <w:tcPr>
-            <w:tcW w:type="dxa" w:w="3504"/>
-          </w:tcPr>
-          <w:p>
-            <w:r>
-              <w:rPr>
-                <w:rFonts w:ascii="Inter" w:hAnsi="Inter"/>
-                <w:b w:val="0"/>
-                <w:sz w:val="20"/>
-              </w:rPr>
-              <w:t>questioning; the never-tell stance</w:t>
-            </w:r>
-          </w:p>
-        </w:tc>
-      </w:tr>
-      <w:tr>
-        <w:tc>
-          <w:tcPr>
-            <w:tcW w:type="dxa" w:w="3504"/>
-          </w:tcPr>
-          <w:p>
-            <w:r>
-              <w:rPr>
-                <w:rFonts w:ascii="Inter" w:hAnsi="Inter"/>
-                <w:b/>
-                <w:sz w:val="20"/>
-              </w:rPr>
-              <w:t>3</w:t>
-            </w:r>
-          </w:p>
-        </w:tc>
-        <w:tc>
-          <w:tcPr>
-            <w:tcW w:type="dxa" w:w="3504"/>
-          </w:tcPr>
-          <w:p>
-            <w:r>
-              <w:rPr>
-                <w:rFonts w:ascii="Inter" w:hAnsi="Inter"/>
-                <w:b/>
-                <w:sz w:val="20"/>
-              </w:rPr>
-              <w:t>van Hiele (1999)</w:t>
-            </w:r>
-          </w:p>
-        </w:tc>
-        <w:tc>
-          <w:tcPr>
-            <w:tcW w:type="dxa" w:w="3504"/>
-          </w:tcPr>
-          <w:p>
-            <w:r>
-              <w:rPr>
-                <w:rFonts w:ascii="Inter" w:hAnsi="Inter"/>
-                <w:b w:val="0"/>
-                <w:sz w:val="20"/>
-              </w:rPr>
-              <w:t>geometric thinking; levels, not ranks</w:t>
-            </w:r>
-          </w:p>
-        </w:tc>
-      </w:tr>
-      <w:tr>
-        <w:tc>
-          <w:tcPr>
-            <w:tcW w:type="dxa" w:w="3504"/>
-          </w:tcPr>
-          <w:p>
-            <w:r>
-              <w:rPr>
-                <w:rFonts w:ascii="Inter" w:hAnsi="Inter"/>
-                <w:b/>
-                <w:sz w:val="20"/>
-              </w:rPr>
-              <w:t>4</w:t>
-            </w:r>
-          </w:p>
-        </w:tc>
-        <w:tc>
-          <w:tcPr>
-            <w:tcW w:type="dxa" w:w="3504"/>
-          </w:tcPr>
-          <w:p>
-            <w:r>
-              <w:rPr>
-                <w:rFonts w:ascii="Inter" w:hAnsi="Inter"/>
-                <w:b/>
-                <w:sz w:val="20"/>
-              </w:rPr>
-              <w:t>[differentiation — TBD]</w:t>
-            </w:r>
-          </w:p>
-        </w:tc>
-        <w:tc>
-          <w:tcPr>
-            <w:tcW w:type="dxa" w:w="3504"/>
-          </w:tcPr>
-          <w:p>
-            <w:r>
-              <w:rPr>
-                <w:rFonts w:ascii="Inter" w:hAnsi="Inter"/>
-                <w:b w:val="0"/>
-                <w:sz w:val="20"/>
-              </w:rPr>
-              <w:t>depth vs. size; anticipating learners</w:t>
-            </w:r>
-          </w:p>
-        </w:tc>
-      </w:tr>
-      <w:tr>
-        <w:tc>
-          <w:tcPr>
-            <w:tcW w:type="dxa" w:w="3504"/>
-          </w:tcPr>
-          <w:p>
-            <w:r>
-              <w:rPr>
-                <w:rFonts w:ascii="Inter" w:hAnsi="Inter"/>
-                <w:b/>
-                <w:sz w:val="20"/>
-              </w:rPr>
-              <w:t>5</w:t>
-            </w:r>
-          </w:p>
-        </w:tc>
-        <w:tc>
-          <w:tcPr>
-            <w:tcW w:type="dxa" w:w="3504"/>
-          </w:tcPr>
-          <w:p>
-            <w:r>
-              <w:rPr>
-                <w:rFonts w:ascii="Inter" w:hAnsi="Inter"/>
-                <w:b/>
-                <w:sz w:val="20"/>
-              </w:rPr>
-              <w:t>[assessment — TBD]</w:t>
-            </w:r>
-          </w:p>
-        </w:tc>
-        <w:tc>
-          <w:tcPr>
-            <w:tcW w:type="dxa" w:w="3504"/>
-          </w:tcPr>
-          <w:p>
-            <w:r>
-              <w:rPr>
-                <w:rFonts w:ascii="Inter" w:hAnsi="Inter"/>
-                <w:b w:val="0"/>
-                <w:sz w:val="20"/>
-              </w:rPr>
-              <w:t>formative judgment; look-fors</w:t>
-            </w:r>
-          </w:p>
-        </w:tc>
-      </w:tr>
-    </w:tbl>
     <w:p>
       <w:pPr>
         <w:spacing w:after="80"/>

</xml_diff>

<commit_message>
Rename reading-journal app Marginalia -> Journaler (wk1-5 sheets)
The Act I reading-journal app is named Journaler now (separate from the
Marginalia close-reader it forked from). Update every student-facing
mention in the wk1-5 reading-homework sheets and the reading-journal doc.

Co-Authored-By: Claude Opus 4.8 (1M context) <noreply@anthropic.com>
</commit_message>
<xml_diff>
--- a/week-1-reasoning-puzzles/reading-journal.docx
+++ b/week-1-reasoning-puzzles/reading-journal.docx
@@ -44,7 +44,7 @@
           <w:rFonts w:ascii="Inter" w:hAnsi="Inter"/>
           <w:i w:val="0"/>
         </w:rPr>
-        <w:t>Each week you read the assigned article(s) and write a single dated journal entry connecting the reading to the mathematics you did that week, kept in Marginalia, our reading-and-writing app. By the end, they show how your thinking grew across Act I.</w:t>
+        <w:t>Each week you read the assigned article(s) and write a single dated journal entry connecting the reading to the mathematics you did that week, kept in Journaler, our reading-and-writing app. By the end, they show how your thinking grew across Act I.</w:t>
       </w:r>
     </w:p>
     <w:p>
@@ -88,7 +88,7 @@
           <w:rFonts w:ascii="Inter" w:hAnsi="Inter"/>
           <w:b/>
         </w:rPr>
-        <w:t xml:space="preserve">Write a dated entry in Marginalia. </w:t>
+        <w:t xml:space="preserve">Write a dated entry in Journaler. </w:t>
       </w:r>
       <w:r>
         <w:rPr>
@@ -140,7 +140,7 @@
           <w:rFonts w:ascii="Inter" w:hAnsi="Inter"/>
           <w:i w:val="0"/>
         </w:rPr>
-        <w:t>At the end of Act I (after Week 5), export your journal from Marginalia and submit it. Graded on your five dated weekly entries — real reflections that connect each reading to that week's mathematics, in your own words. Not on how polished they are.</w:t>
+        <w:t>At the end of Act I (after Week 5), export your journal from Journaler and submit it. Graded on your five dated weekly entries — real reflections that connect each reading to that week's mathematics, in your own words. Not on how polished they are.</w:t>
       </w:r>
     </w:p>
     <w:sectPr>

</xml_diff>

<commit_message>
Reading Journal: reframe to chat-entry model + add rubric (Act I)
Entries are now conversations with Todd-in-a-Can that land on the student's take, not
written reflections. reading-journal.docx gains a "How each entry is scored" rubric
(Grounded in the reading /3, Genuine thinking with Todd /4, Lands a considered take /3;
10/entry x5 = 50). All 5 weekly sheets: intro shifted from "write one dated journal
entry" to "work through it with Todd-in-a-Can ... land on your take."

Co-Authored-By: Claude Opus 4.8 (1M context) <noreply@anthropic.com>
</commit_message>
<xml_diff>
--- a/week-1-reasoning-puzzles/reading-journal.docx
+++ b/week-1-reasoning-puzzles/reading-journal.docx
@@ -42,9 +42,8 @@
       <w:r>
         <w:rPr>
           <w:rFonts w:ascii="Inter" w:hAnsi="Inter"/>
-          <w:i w:val="0"/>
         </w:rPr>
-        <w:t>Each week you read the assigned article(s) and write a single dated journal entry connecting the reading to the mathematics you did that week, kept in Journaler, our reading-and-writing app. By the end, they show how your thinking grew across Act I.</w:t>
+        <w:t>Each week you read the assigned article, mark the passages that strike you, and think it through with Todd-in-a-Can — an AI reading partner in Journaler (our reading-and-writing app) who asks questions but never hands you answers. That conversation, landing on your own take on the week's prompt, is your entry. By the end, your five entries show how your thinking grew across Act I.</w:t>
       </w:r>
     </w:p>
     <w:p>
@@ -88,13 +87,13 @@
           <w:rFonts w:ascii="Inter" w:hAnsi="Inter"/>
           <w:b/>
         </w:rPr>
-        <w:t xml:space="preserve">Write a dated entry in Journaler. </w:t>
+        <w:t xml:space="preserve">Mark it up, then talk it through. </w:t>
       </w:r>
       <w:r>
         <w:rPr>
           <w:rFonts w:ascii="Inter" w:hAnsi="Inter"/>
         </w:rPr>
-        <w:t>Make notes in the margins as you read, then write a short reflection connecting it to that week's mathematics and your own reasoning. One entry per week; each week's homework sheet gives you that week's prompt.</w:t>
+        <w:t>Highlight the passages that strike you, then work through them with Todd-in-a-Can. Todd asks about what you marked and steers toward that week's prompt — you do the thinking. Before you stop, Todd asks you to state your take in a few sentences; that closing take is the heart of the entry. One entry per week; each week's homework sheet gives you that week's prompt.</w:t>
       </w:r>
     </w:p>
     <w:p>
@@ -115,9 +114,8 @@
       <w:r>
         <w:rPr>
           <w:rFonts w:ascii="Inter" w:hAnsi="Inter"/>
-          <w:i w:val="0"/>
         </w:rPr>
-        <w:t>Each entry is dated and specific to that week — to your class, your math, your own reasoning. That means you can't write it all the night before it's due. Write each entry while the week is fresh — that's the point of a journal.</w:t>
+        <w:t>Each entry is dated and specific to that week — your class, your math, your own reasoning. That means you can't do it all the night before it's due. Have the conversation while the week is fresh — that's the point of a journal.</w:t>
       </w:r>
     </w:p>
     <w:p>
@@ -138,9 +136,241 @@
       <w:r>
         <w:rPr>
           <w:rFonts w:ascii="Inter" w:hAnsi="Inter"/>
-          <w:i w:val="0"/>
         </w:rPr>
-        <w:t>At the end of Act I (after Week 5), export your journal from Journaler and submit it. Graded on your five dated weekly entries — real reflections that connect each reading to that week's mathematics, in your own words. Not on how polished they are.</w:t>
+        <w:t>At the end of Act I (after Week 5), open the Journal in Journaler and Print / PDF the whole thing as one file to submit. Each week shows the prompt, the passages you marked, and your conversation with Todd landing on your take.</w:t>
+      </w:r>
+    </w:p>
+    <w:p>
+      <w:pPr>
+        <w:spacing w:before="160" w:after="80"/>
+      </w:pPr>
+      <w:r>
+        <w:rPr>
+          <w:rFonts w:ascii="Inter" w:hAnsi="Inter"/>
+          <w:b/>
+          <w:color w:val="1F4E96"/>
+          <w:sz w:val="24"/>
+        </w:rPr>
+        <w:t>How each entry is scored</w:t>
+      </w:r>
+    </w:p>
+    <w:p>
+      <w:r>
+        <w:rPr>
+          <w:rFonts w:ascii="Inter" w:hAnsi="Inter"/>
+        </w:rPr>
+        <w:t>Each week's entry is scored out of 10 — your five entries make up the 50-point Reading Journal. Because the entry is a conversation, not an essay, it is graded on the thinking, not on polish:</w:t>
+      </w:r>
+    </w:p>
+    <w:tbl>
+      <w:tblPr>
+        <w:tblStyle w:val="TableGrid"/>
+        <w:tblW w:type="auto" w:w="0"/>
+        <w:tblLook w:firstColumn="1" w:firstRow="1" w:lastColumn="0" w:lastRow="0" w:noHBand="0" w:noVBand="1" w:val="04A0"/>
+      </w:tblPr>
+      <w:tblGrid>
+        <w:gridCol w:w="3504"/>
+        <w:gridCol w:w="3504"/>
+        <w:gridCol w:w="3504"/>
+      </w:tblGrid>
+      <w:tr>
+        <w:tc>
+          <w:tcPr>
+            <w:tcW w:type="dxa" w:w="3024"/>
+            <w:shd w:val="clear" w:fill="D9D9D9"/>
+          </w:tcPr>
+          <w:p>
+            <w:r/>
+            <w:r>
+              <w:rPr>
+                <w:rFonts w:ascii="Inter" w:hAnsi="Inter"/>
+                <w:b/>
+              </w:rPr>
+              <w:t>What earns the points</w:t>
+            </w:r>
+          </w:p>
+        </w:tc>
+        <w:tc>
+          <w:tcPr>
+            <w:tcW w:type="dxa" w:w="720"/>
+            <w:shd w:val="clear" w:fill="D9D9D9"/>
+          </w:tcPr>
+          <w:p>
+            <w:r/>
+            <w:r>
+              <w:rPr>
+                <w:rFonts w:ascii="Inter" w:hAnsi="Inter"/>
+                <w:b/>
+              </w:rPr>
+              <w:t>Pts</w:t>
+            </w:r>
+          </w:p>
+        </w:tc>
+        <w:tc>
+          <w:tcPr>
+            <w:tcW w:type="dxa" w:w="6336"/>
+            <w:shd w:val="clear" w:fill="D9D9D9"/>
+          </w:tcPr>
+          <w:p>
+            <w:r/>
+            <w:r>
+              <w:rPr>
+                <w:rFonts w:ascii="Inter" w:hAnsi="Inter"/>
+                <w:b/>
+              </w:rPr>
+              <w:t>What it looks like</w:t>
+            </w:r>
+          </w:p>
+        </w:tc>
+      </w:tr>
+      <w:tr>
+        <w:tc>
+          <w:tcPr>
+            <w:tcW w:type="dxa" w:w="3024"/>
+          </w:tcPr>
+          <w:p>
+            <w:r/>
+            <w:r>
+              <w:rPr>
+                <w:rFonts w:ascii="Inter" w:hAnsi="Inter"/>
+                <w:b/>
+              </w:rPr>
+              <w:t>Grounded in the reading</w:t>
+            </w:r>
+          </w:p>
+        </w:tc>
+        <w:tc>
+          <w:tcPr>
+            <w:tcW w:type="dxa" w:w="720"/>
+          </w:tcPr>
+          <w:p>
+            <w:r/>
+            <w:r>
+              <w:rPr>
+                <w:rFonts w:ascii="Inter" w:hAnsi="Inter"/>
+                <w:b w:val="0"/>
+              </w:rPr>
+              <w:t>3</w:t>
+            </w:r>
+          </w:p>
+        </w:tc>
+        <w:tc>
+          <w:tcPr>
+            <w:tcW w:type="dxa" w:w="6336"/>
+          </w:tcPr>
+          <w:p>
+            <w:r/>
+            <w:r>
+              <w:rPr>
+                <w:rFonts w:ascii="Inter" w:hAnsi="Inter"/>
+                <w:b w:val="0"/>
+              </w:rPr>
+              <w:t>You marked real passages and brought them into the conversation as evidence — not talking about the reading in the abstract.</w:t>
+            </w:r>
+          </w:p>
+        </w:tc>
+      </w:tr>
+      <w:tr>
+        <w:tc>
+          <w:tcPr>
+            <w:tcW w:type="dxa" w:w="3024"/>
+          </w:tcPr>
+          <w:p>
+            <w:r/>
+            <w:r>
+              <w:rPr>
+                <w:rFonts w:ascii="Inter" w:hAnsi="Inter"/>
+                <w:b/>
+              </w:rPr>
+              <w:t>Genuine thinking with Todd</w:t>
+            </w:r>
+          </w:p>
+        </w:tc>
+        <w:tc>
+          <w:tcPr>
+            <w:tcW w:type="dxa" w:w="720"/>
+          </w:tcPr>
+          <w:p>
+            <w:r/>
+            <w:r>
+              <w:rPr>
+                <w:rFonts w:ascii="Inter" w:hAnsi="Inter"/>
+                <w:b w:val="0"/>
+              </w:rPr>
+              <w:t>4</w:t>
+            </w:r>
+          </w:p>
+        </w:tc>
+        <w:tc>
+          <w:tcPr>
+            <w:tcW w:type="dxa" w:w="6336"/>
+          </w:tcPr>
+          <w:p>
+            <w:r/>
+            <w:r>
+              <w:rPr>
+                <w:rFonts w:ascii="Inter" w:hAnsi="Inter"/>
+                <w:b w:val="0"/>
+              </w:rPr>
+              <w:t>Real back-and-forth: you engaged the questions, pushed your own reasoning, and didn't just answer to be done.</w:t>
+            </w:r>
+          </w:p>
+        </w:tc>
+      </w:tr>
+      <w:tr>
+        <w:tc>
+          <w:tcPr>
+            <w:tcW w:type="dxa" w:w="3024"/>
+          </w:tcPr>
+          <w:p>
+            <w:r/>
+            <w:r>
+              <w:rPr>
+                <w:rFonts w:ascii="Inter" w:hAnsi="Inter"/>
+                <w:b/>
+              </w:rPr>
+              <w:t>Lands a considered take</w:t>
+            </w:r>
+          </w:p>
+        </w:tc>
+        <w:tc>
+          <w:tcPr>
+            <w:tcW w:type="dxa" w:w="720"/>
+          </w:tcPr>
+          <w:p>
+            <w:r/>
+            <w:r>
+              <w:rPr>
+                <w:rFonts w:ascii="Inter" w:hAnsi="Inter"/>
+                <w:b w:val="0"/>
+              </w:rPr>
+              <w:t>3</w:t>
+            </w:r>
+          </w:p>
+        </w:tc>
+        <w:tc>
+          <w:tcPr>
+            <w:tcW w:type="dxa" w:w="6336"/>
+          </w:tcPr>
+          <w:p>
+            <w:r/>
+            <w:r>
+              <w:rPr>
+                <w:rFonts w:ascii="Inter" w:hAnsi="Inter"/>
+                <w:b w:val="0"/>
+              </w:rPr>
+              <w:t>Your closing take reaches a real position on the week's prompt and ties it to the mathematics you did that week.</w:t>
+            </w:r>
+          </w:p>
+        </w:tc>
+      </w:tr>
+    </w:tbl>
+    <w:p>
+      <w:r>
+        <w:rPr>
+          <w:rFonts w:ascii="Inter" w:hAnsi="Inter"/>
+        </w:rPr>
+        <w:t>Five weekly entries × 10 = 50 points. Graded on your reasoning and honesty about what you found, not on how polished it is.</w:t>
       </w:r>
     </w:p>
     <w:sectPr>

</xml_diff>

<commit_message>
The revised Reading Journal becomes the one students actually open
The rewrite landed as reading-journal-revised.docx, sitting beside the original. But
review.html links to reading-journal.docx, so what was live was the worst of both: the
new 5-and-5 table under the OLD prose, still telling students to work through the
reading with Todd-in-a-Can and still calling the entry a conversation. Five
requires-Todd phrases against a rubric that no longer scores one.

The revision now IS reading-journal.docx and the -revised copy is gone -- two files
where one is stale is the thing the archive rule exists to prevent, and here the stale
one was the one with the link pointing at it.

Verified in the linked file: rubric rows Grounded 5 and Lands a considered take 5, three
Todd mentions all framed as an invitation ("if you want a sounding board", "if you had
one"), and zero phrases that require him.
</commit_message>
<xml_diff>
--- a/week-1-reasoning-puzzles/reading-journal.docx
+++ b/week-1-reasoning-puzzles/reading-journal.docx
@@ -43,7 +43,7 @@
         <w:rPr>
           <w:rFonts w:ascii="Calibri" w:hAnsi="Calibri"/>
         </w:rPr>
-        <w:t>Each week you read the assigned article, mark the passages that strike you, and think it through with Todd-in-a-Can — an AI reading partner in Journaler (our reading-and-writing app) who asks questions but never hands you answers. That conversation, landing on your own take on the week's prompt, is your entry. By the end, your five entries show how your thinking grew across Act I.</w:t>
+        <w:t>Each week you read the assigned article, mark the passages that strike you, and write your own take on the week's prompt. Those marked passages and that take are your entry. If you want a sounding board along the way, Todd-in-a-Can, an AI reading partner in Journaler (our reading-and-writing app), will ask you questions but never hand you answers. Using it is optional. By the end, your five entries show how your thinking grew across Act I.</w:t>
       </w:r>
     </w:p>
     <w:p>
@@ -87,13 +87,31 @@
           <w:rFonts w:ascii="Calibri" w:hAnsi="Calibri"/>
           <w:b/>
         </w:rPr>
-        <w:t xml:space="preserve">Mark it up, then talk it through. </w:t>
+        <w:t xml:space="preserve">Mark it up, then land your take. </w:t>
       </w:r>
       <w:r>
         <w:rPr>
           <w:rFonts w:ascii="Calibri" w:hAnsi="Calibri"/>
         </w:rPr>
-        <w:t>Highlight the passages that strike you, then work through them with Todd-in-a-Can. Todd asks about what you marked and steers toward that week's prompt — you do the thinking. Before you stop, Todd asks you to state your take in a few sentences; that closing take is the heart of the entry. One entry per week; each week's homework sheet gives you that week's prompt.</w:t>
+        <w:t>Highlight the passages that strike you, then write your take on that week's prompt in a few sentences, tying it to the math you did. That closing take is the heart of the entry. One entry per week; each week's homework sheet gives you that week's prompt.</w:t>
+      </w:r>
+    </w:p>
+    <w:p>
+      <w:pPr>
+        <w:pStyle w:val="ListBullet"/>
+      </w:pPr>
+      <w:r>
+        <w:rPr>
+          <w:rFonts w:ascii="Calibri" w:hAnsi="Calibri"/>
+          <w:b/>
+        </w:rPr>
+        <w:t xml:space="preserve">Talk it through if you want to (optional). </w:t>
+      </w:r>
+      <w:r>
+        <w:rPr>
+          <w:rFonts w:ascii="Calibri" w:hAnsi="Calibri"/>
+        </w:rPr>
+        <w:t>Todd-in-a-Can is there if you want a sounding board. It asks about what you marked and steers toward the prompt, but it doesn't hand you answers and it doesn't earn you points. Skip it entirely if you'd rather think on paper, or with a classmate.</w:t>
       </w:r>
     </w:p>
     <w:p>
@@ -115,7 +133,7 @@
         <w:rPr>
           <w:rFonts w:ascii="Calibri" w:hAnsi="Calibri"/>
         </w:rPr>
-        <w:t>Each entry is dated and specific to that week — your class, your math, your own reasoning. That means you can't do it all the night before it's due. Have the conversation while the week is fresh — that's the point of a journal.</w:t>
+        <w:t>Each entry is dated and specific to that week — your class, your math, your own reasoning. That means you can't do it all the night before it's due. Write the entry while the week is fresh — that's the point of a journal.</w:t>
       </w:r>
     </w:p>
     <w:p>
@@ -137,7 +155,7 @@
         <w:rPr>
           <w:rFonts w:ascii="Calibri" w:hAnsi="Calibri"/>
         </w:rPr>
-        <w:t>At the end of Act I (after Week 5), open the Journal in Journaler and Print / PDF the whole thing as one file to submit. Each week shows the prompt, the passages you marked, and your conversation with Todd landing on your take.</w:t>
+        <w:t>At the end of Act I (after Week 5), open the Journal in Journaler and Print / PDF the whole thing as one file to submit. Each week shows the prompt, the passages you marked, and your take (plus your conversation with Todd-in-a-Can, if you had one).</w:t>
       </w:r>
     </w:p>
     <w:p>
@@ -159,7 +177,7 @@
         <w:rPr>
           <w:rFonts w:ascii="Calibri" w:hAnsi="Calibri"/>
         </w:rPr>
-        <w:t>Each week's entry is scored out of 10 — your five entries make up the 50-point Reading Journal. Because the entry is a conversation, not an essay, it is graded on the thinking, not on polish:</w:t>
+        <w:t>Each week's entry is scored out of 10 — your five entries make up the 50-point Reading Journal. Because the entry is a journal, not an essay, it is graded on the thinking, not on polish:</w:t>
       </w:r>
     </w:p>
     <w:tbl>
@@ -265,7 +283,7 @@
                 <w:rFonts w:ascii="Calibri" w:hAnsi="Calibri"/>
                 <w:b w:val="0"/>
               </w:rPr>
-              <w:t>You marked real passages and brought them into the conversation as evidence — not talking about the reading in the abstract.</w:t>
+              <w:t>You marked real passages and brought them into your entry as evidence — not talking about the reading in the abstract.</w:t>
             </w:r>
           </w:p>
         </w:tc>

</xml_diff>